<commit_message>
docs: responsáveis pelos próximos modelos e ajustes no documento
- seção 4.1: divisão dos modelos a treinar entre a equipe
- remoção da tabela de situação dos requisitos e renumeração da seção 4
- ajustes de layout e idioma do documento

Co-Authored-By: Claude Sonnet 5.5 <noreply@anthropic.com>
</commit_message>
<xml_diff>
--- a/docs/documentacao_decisoes.docx
+++ b/docs/documentacao_decisoes.docx
@@ -22860,7 +22860,7 @@
         <w:t xml:space="preserve">1. Regressão linear sem regularização.</w:t>
       </w:r>
       <w:r>
-        <w:t xml:space="preserve"> Treinar a LinearRegression nos conjuntos A, B e D, com a mesma tabela de metodologia e resultados (Tabela 15). Ela entra também na avaliação final no teste, ao lado do baseline.</w:t>
+        <w:t xml:space="preserve"> Treinar a LinearRegression nos conjuntos A, B e D, com a mesma tabela de metodologia e resultados (Tabela 15). Ela entra também na avaliação final no teste, ao lado do baseline. Responsável: Raquel Albuquerque Quirino.</w:t>
       </w:r>
     </w:p>
     <w:p>
@@ -22876,7 +22876,7 @@
         <w:t xml:space="preserve">2. Demais regressores.</w:t>
       </w:r>
       <w:r>
-        <w:t xml:space="preserve"> Árvore de decisão, KNN, SVR (justificando o kernel), bagging, pasting, Random Forest, pelo menos um boosting (por exemplo, HistGradientBoostingRegressor) e stacking, treinado com previsões fora da dobra. Todos nos conjuntos A, B e D e com as configurações iniciais registradas antes das buscas.</w:t>
+        <w:t xml:space="preserve"> Árvore de decisão, KNN, SVR (justificando o kernel), bagging, pasting, Random Forest, pelo menos um boosting (por exemplo, HistGradientBoostingRegressor) e stacking, treinado com previsões fora da dobra. Todos nos conjuntos A, B e D e com as configurações iniciais registradas antes das buscas. Responsáveis: João Igor Vidal de Andrade (Random Forest, Gradient Boosting e Stacking), Raquel Albuquerque Quirino (árvore de decisão), Amanda Lira (KNN e SVR) e Sofya Oliveira (bagging e pasting).</w:t>
       </w:r>
     </w:p>
     <w:p>

</xml_diff>